<commit_message>
add scan error 1810 help advice to RandomErrorList
</commit_message>
<xml_diff>
--- a/RandomErrorList.docx
+++ b/RandomErrorList.docx
@@ -73,6 +73,65 @@
         <w:t>I saw this error when someone had their event grid set to 0ms update rate</w:t>
       </w:r>
     </w:p>
+    <w:p/>
+    <w:p>
+      <w:r>
+        <w:t>Scanning IO error 1810 look here</w:t>
+      </w:r>
+    </w:p>
+    <w:p>
+      <w:r>
+        <w:drawing>
+          <wp:inline distT="0" distB="0" distL="0" distR="0" wp14:anchorId="5D27CA14" wp14:editId="18EF4DA8">
+            <wp:extent cx="4564380" cy="2628900"/>
+            <wp:effectExtent l="0" t="0" r="7620" b="0"/>
+            <wp:docPr id="1142028767" name="Picture 2" descr="A screenshot of a computer&#10;&#10;AI-generated content may be incorrect."/>
+            <wp:cNvGraphicFramePr>
+              <a:graphicFrameLocks xmlns:a="http://schemas.openxmlformats.org/drawingml/2006/main" noChangeAspect="1"/>
+            </wp:cNvGraphicFramePr>
+            <a:graphic xmlns:a="http://schemas.openxmlformats.org/drawingml/2006/main">
+              <a:graphicData uri="http://schemas.openxmlformats.org/drawingml/2006/picture">
+                <pic:pic xmlns:pic="http://schemas.openxmlformats.org/drawingml/2006/picture">
+                  <pic:nvPicPr>
+                    <pic:cNvPr id="1142028767" name="Picture 2" descr="A screenshot of a computer&#10;&#10;AI-generated content may be incorrect."/>
+                    <pic:cNvPicPr>
+                      <a:picLocks noChangeAspect="1" noChangeArrowheads="1"/>
+                    </pic:cNvPicPr>
+                  </pic:nvPicPr>
+                  <pic:blipFill>
+                    <a:blip r:embed="rId5">
+                      <a:extLst>
+                        <a:ext uri="{28A0092B-C50C-407E-A947-70E740481C1C}">
+                          <a14:useLocalDpi xmlns:a14="http://schemas.microsoft.com/office/drawing/2010/main" val="0"/>
+                        </a:ext>
+                      </a:extLst>
+                    </a:blip>
+                    <a:srcRect/>
+                    <a:stretch>
+                      <a:fillRect/>
+                    </a:stretch>
+                  </pic:blipFill>
+                  <pic:spPr bwMode="auto">
+                    <a:xfrm>
+                      <a:off x="0" y="0"/>
+                      <a:ext cx="4564380" cy="2628900"/>
+                    </a:xfrm>
+                    <a:prstGeom prst="rect">
+                      <a:avLst/>
+                    </a:prstGeom>
+                    <a:noFill/>
+                    <a:ln>
+                      <a:noFill/>
+                    </a:ln>
+                  </pic:spPr>
+                </pic:pic>
+              </a:graphicData>
+            </a:graphic>
+          </wp:inline>
+        </w:drawing>
+      </w:r>
+    </w:p>
+    <w:p/>
     <w:sectPr>
       <w:pgSz w:w="12240" w:h="15840"/>
       <w:pgMar w:top="1440" w:right="1440" w:bottom="1440" w:left="1440" w:header="720" w:footer="720" w:gutter="0"/>

</xml_diff>